<commit_message>
added image and a new personal project
</commit_message>
<xml_diff>
--- a/Hamza-Syrage-Frontend-Engineer-Resume.docx
+++ b/Hamza-Syrage-Frontend-Engineer-Resume.docx
@@ -4,7 +4,7 @@
   <w:body>
     <w:p>
       <w:pPr>
-        <w:spacing w:after="30"/>
+        <w:spacing w:after="20"/>
         <w:jc w:val="center"/>
       </w:pPr>
       <w:r>
@@ -53,7 +53,7 @@
         <w:br/>
         <w:t xml:space="preserve"/>
       </w:r>
-      <w:hyperlink w:history="1" r:id="rIdwtje3fpifp7wj0og-zp7d">
+      <w:hyperlink w:history="1" r:id="rIdj79fjizi2n39utsxfxwrm">
         <w:r>
           <w:rPr>
             <w:rStyle w:val="Hyperlink"/>
@@ -74,7 +74,7 @@
         </w:rPr>
         <w:t xml:space="preserve">  |  </w:t>
       </w:r>
-      <w:hyperlink w:history="1" r:id="rIdgksybsmpdjvngdjbfpas_">
+      <w:hyperlink w:history="1" r:id="rIdyd_jdugpahdc97tpm8mnz">
         <w:r>
           <w:rPr>
             <w:rStyle w:val="Hyperlink"/>
@@ -95,7 +95,7 @@
         </w:rPr>
         <w:t xml:space="preserve">  |  </w:t>
       </w:r>
-      <w:hyperlink w:history="1" r:id="rIdkeoizme3nbdyjv5g4cg-b">
+      <w:hyperlink w:history="1" r:id="rIds1c7ssyv4fadixpyvlfe-">
         <w:r>
           <w:rPr>
             <w:rStyle w:val="Hyperlink"/>
@@ -121,7 +121,7 @@
         <w:pBdr>
           <w:bottom w:val="single" w:color="9CA3AF" w:sz="4"/>
         </w:pBdr>
-        <w:spacing w:after="40" w:before="120"/>
+        <w:spacing w:after="30" w:before="90"/>
       </w:pPr>
       <w:r>
         <w:rPr>
@@ -138,7 +138,7 @@
     </w:p>
     <w:p>
       <w:pPr>
-        <w:spacing w:after="30"/>
+        <w:spacing w:after="20"/>
       </w:pPr>
       <w:r>
         <w:rPr>
@@ -155,7 +155,7 @@
         <w:pBdr>
           <w:bottom w:val="single" w:color="9CA3AF" w:sz="4"/>
         </w:pBdr>
-        <w:spacing w:after="40" w:before="120"/>
+        <w:spacing w:after="30" w:before="90"/>
       </w:pPr>
       <w:r>
         <w:rPr>
@@ -175,19 +175,31 @@
         <w:tabs>
           <w:tab w:val="right" w:pos="9360"/>
         </w:tabs>
-        <w:spacing w:after="10" w:before="80"/>
-      </w:pPr>
-      <w:r>
-        <w:rPr>
-          <w:rFonts w:ascii="Calibri" w:cs="Calibri" w:eastAsia="Calibri" w:hAnsi="Calibri"/>
-          <w:b/>
-          <w:bCs/>
-          <w:color w:val="1F2937"/>
-          <w:sz w:val="22"/>
-          <w:szCs w:val="22"/>
-        </w:rPr>
-        <w:t xml:space="preserve">Frontend Developer - Lucidly</w:t>
-      </w:r>
+        <w:spacing w:after="8" w:before="60"/>
+      </w:pPr>
+      <w:r>
+        <w:rPr>
+          <w:rFonts w:ascii="Calibri" w:cs="Calibri" w:eastAsia="Calibri" w:hAnsi="Calibri"/>
+          <w:b/>
+          <w:bCs/>
+          <w:color w:val="1F2937"/>
+          <w:sz w:val="20"/>
+          <w:szCs w:val="20"/>
+        </w:rPr>
+        <w:t xml:space="preserve">Frontend Developer - </w:t>
+      </w:r>
+      <w:hyperlink w:history="1" r:id="rIdsl-8xxpjkkgdbyrybkzrt">
+        <w:r>
+          <w:rPr>
+            <w:rStyle w:val="Hyperlink"/>
+            <w:rFonts w:ascii="Calibri" w:cs="Calibri" w:eastAsia="Calibri" w:hAnsi="Calibri"/>
+            <w:color w:val="334155"/>
+            <w:sz w:val="18"/>
+            <w:szCs w:val="18"/>
+          </w:rPr>
+          <w:t xml:space="preserve">Lucidly</w:t>
+        </w:r>
+      </w:hyperlink>
       <w:r>
         <w:rPr>
           <w:rFonts w:ascii="Calibri" w:cs="Calibri" w:eastAsia="Calibri" w:hAnsi="Calibri"/>
@@ -202,7 +214,7 @@
     </w:p>
     <w:p>
       <w:pPr>
-        <w:spacing w:after="30"/>
+        <w:spacing w:after="20"/>
       </w:pPr>
       <w:r>
         <w:rPr>
@@ -213,17 +225,29 @@
           <w:sz w:val="20"/>
           <w:szCs w:val="20"/>
         </w:rPr>
-        <w:t xml:space="preserve">Remote (UAE) - client work delivered for Axenso</w:t>
-      </w:r>
-    </w:p>
-    <w:p>
-      <w:pPr>
-        <w:pStyle w:val="ListParagraph"/>
-        <w:numPr>
-          <w:ilvl w:val="0"/>
-          <w:numId w:val="2"/>
-        </w:numPr>
-        <w:spacing w:after="30"/>
+        <w:t xml:space="preserve">Remote (UAE) - client work delivered for </w:t>
+      </w:r>
+      <w:hyperlink w:history="1" r:id="rIddoieuxa9jjewkk6iy3jun">
+        <w:r>
+          <w:rPr>
+            <w:rStyle w:val="Hyperlink"/>
+            <w:rFonts w:ascii="Calibri" w:cs="Calibri" w:eastAsia="Calibri" w:hAnsi="Calibri"/>
+            <w:color w:val="334155"/>
+            <w:sz w:val="18"/>
+            <w:szCs w:val="18"/>
+          </w:rPr>
+          <w:t xml:space="preserve">Axenso</w:t>
+        </w:r>
+      </w:hyperlink>
+    </w:p>
+    <w:p>
+      <w:pPr>
+        <w:pStyle w:val="ListParagraph"/>
+        <w:numPr>
+          <w:ilvl w:val="0"/>
+          <w:numId w:val="2"/>
+        </w:numPr>
+        <w:spacing w:after="20"/>
       </w:pPr>
       <w:r>
         <w:rPr>
@@ -253,7 +277,7 @@
           <w:ilvl w:val="0"/>
           <w:numId w:val="2"/>
         </w:numPr>
-        <w:spacing w:after="30"/>
+        <w:spacing w:after="20"/>
       </w:pPr>
       <w:r>
         <w:rPr>
@@ -283,7 +307,7 @@
           <w:ilvl w:val="0"/>
           <w:numId w:val="2"/>
         </w:numPr>
-        <w:spacing w:after="30"/>
+        <w:spacing w:after="20"/>
       </w:pPr>
       <w:r>
         <w:rPr>
@@ -313,7 +337,7 @@
           <w:ilvl w:val="0"/>
           <w:numId w:val="2"/>
         </w:numPr>
-        <w:spacing w:after="30"/>
+        <w:spacing w:after="20"/>
       </w:pPr>
       <w:r>
         <w:rPr>
@@ -341,7 +365,7 @@
         <w:pBdr>
           <w:bottom w:val="single" w:color="9CA3AF" w:sz="4"/>
         </w:pBdr>
-        <w:spacing w:after="40" w:before="120"/>
+        <w:spacing w:after="30" w:before="90"/>
       </w:pPr>
       <w:r>
         <w:rPr>
@@ -361,7 +385,7 @@
         <w:tabs>
           <w:tab w:val="right" w:pos="9360"/>
         </w:tabs>
-        <w:spacing w:after="10" w:before="80"/>
+        <w:spacing w:after="8" w:before="60"/>
       </w:pPr>
       <w:r>
         <w:rPr>
@@ -374,7 +398,7 @@
         </w:rPr>
         <w:t xml:space="preserve">Portfolio Site - </w:t>
       </w:r>
-      <w:hyperlink w:history="1" r:id="rIdzfvdodk3f7t01oztmpnac">
+      <w:hyperlink w:history="1" r:id="rIdy4womxqklgpfg5qxpqdi_">
         <w:r>
           <w:rPr>
             <w:rStyle w:val="Hyperlink"/>
@@ -394,7 +418,7 @@
           <w:ilvl w:val="0"/>
           <w:numId w:val="2"/>
         </w:numPr>
-        <w:spacing w:after="30"/>
+        <w:spacing w:after="20"/>
       </w:pPr>
       <w:r>
         <w:rPr>
@@ -411,7 +435,7 @@
         <w:tabs>
           <w:tab w:val="right" w:pos="9360"/>
         </w:tabs>
-        <w:spacing w:after="10" w:before="80"/>
+        <w:spacing w:after="8" w:before="60"/>
       </w:pPr>
       <w:r>
         <w:rPr>
@@ -424,7 +448,7 @@
         </w:rPr>
         <w:t xml:space="preserve">3D Physics-Based Ping Pong Simulation - </w:t>
       </w:r>
-      <w:hyperlink w:history="1" r:id="rIdeqksubrykj1eektgle-c7">
+      <w:hyperlink w:history="1" r:id="rIdieygxzjqj1hcozkwl_bfr">
         <w:r>
           <w:rPr>
             <w:rStyle w:val="Hyperlink"/>
@@ -444,7 +468,7 @@
           <w:ilvl w:val="0"/>
           <w:numId w:val="2"/>
         </w:numPr>
-        <w:spacing w:after="30"/>
+        <w:spacing w:after="20"/>
       </w:pPr>
       <w:r>
         <w:rPr>
@@ -454,6 +478,56 @@
           <w:szCs w:val="20"/>
         </w:rPr>
         <w:t xml:space="preserve">Built a real-time table tennis simulator in Three.js and TypeScript from scratch: RK4 numerical integration, Magnus force and drag modeling, custom collision resolution, bot AI, full scoring/fault rules, and a gyroscope-driven mobile controller with live two-way sync to a debug UI.</w:t>
+      </w:r>
+    </w:p>
+    <w:p>
+      <w:pPr>
+        <w:tabs>
+          <w:tab w:val="right" w:pos="9360"/>
+        </w:tabs>
+        <w:spacing w:after="8" w:before="60"/>
+      </w:pPr>
+      <w:r>
+        <w:rPr>
+          <w:rFonts w:ascii="Calibri" w:cs="Calibri" w:eastAsia="Calibri" w:hAnsi="Calibri"/>
+          <w:b/>
+          <w:bCs/>
+          <w:color w:val="1F2937"/>
+          <w:sz w:val="20"/>
+          <w:szCs w:val="20"/>
+        </w:rPr>
+        <w:t xml:space="preserve">StayBay - </w:t>
+      </w:r>
+      <w:hyperlink w:history="1" r:id="rIdovkpacrt508dpmyyc9m_z">
+        <w:r>
+          <w:rPr>
+            <w:rStyle w:val="Hyperlink"/>
+            <w:rFonts w:ascii="Calibri" w:cs="Calibri" w:eastAsia="Calibri" w:hAnsi="Calibri"/>
+            <w:color w:val="334155"/>
+            <w:sz w:val="18"/>
+            <w:szCs w:val="18"/>
+          </w:rPr>
+          <w:t xml:space="preserve">github.com/HamzaSyrage/staybay-backend</w:t>
+        </w:r>
+      </w:hyperlink>
+    </w:p>
+    <w:p>
+      <w:pPr>
+        <w:pStyle w:val="ListParagraph"/>
+        <w:numPr>
+          <w:ilvl w:val="0"/>
+          <w:numId w:val="2"/>
+        </w:numPr>
+        <w:spacing w:after="20"/>
+      </w:pPr>
+      <w:r>
+        <w:rPr>
+          <w:rFonts w:ascii="Calibri" w:cs="Calibri" w:eastAsia="Calibri" w:hAnsi="Calibri"/>
+          <w:color w:val="1F2937"/>
+          <w:sz w:val="20"/>
+          <w:szCs w:val="20"/>
+        </w:rPr>
+        <w:t xml:space="preserve">Laravel + Sanctum REST API for an Airbnb-style booking platform: escrow-style hold-balance wallet, a scheduled service that auto-transitions bookings by date and payment state, overlap-safe availability checks with date-range merging, and a dynamic query-filter system for search.</w:t>
       </w:r>
     </w:p>
     <w:p>
@@ -461,7 +535,7 @@
         <w:pBdr>
           <w:bottom w:val="single" w:color="9CA3AF" w:sz="4"/>
         </w:pBdr>
-        <w:spacing w:after="40" w:before="120"/>
+        <w:spacing w:after="30" w:before="90"/>
       </w:pPr>
       <w:r>
         <w:rPr>
@@ -483,7 +557,7 @@
           <w:ilvl w:val="0"/>
           <w:numId w:val="2"/>
         </w:numPr>
-        <w:spacing w:after="30"/>
+        <w:spacing w:after="20"/>
       </w:pPr>
       <w:r>
         <w:rPr>
@@ -513,7 +587,7 @@
           <w:ilvl w:val="0"/>
           <w:numId w:val="2"/>
         </w:numPr>
-        <w:spacing w:after="30"/>
+        <w:spacing w:after="20"/>
       </w:pPr>
       <w:r>
         <w:rPr>
@@ -543,7 +617,7 @@
           <w:ilvl w:val="0"/>
           <w:numId w:val="2"/>
         </w:numPr>
-        <w:spacing w:after="30"/>
+        <w:spacing w:after="20"/>
       </w:pPr>
       <w:r>
         <w:rPr>
@@ -573,7 +647,7 @@
           <w:ilvl w:val="0"/>
           <w:numId w:val="2"/>
         </w:numPr>
-        <w:spacing w:after="30"/>
+        <w:spacing w:after="20"/>
       </w:pPr>
       <w:r>
         <w:rPr>
@@ -603,7 +677,7 @@
           <w:ilvl w:val="0"/>
           <w:numId w:val="2"/>
         </w:numPr>
-        <w:spacing w:after="30"/>
+        <w:spacing w:after="20"/>
       </w:pPr>
       <w:r>
         <w:rPr>
@@ -633,7 +707,7 @@
           <w:ilvl w:val="0"/>
           <w:numId w:val="2"/>
         </w:numPr>
-        <w:spacing w:after="30"/>
+        <w:spacing w:after="20"/>
       </w:pPr>
       <w:r>
         <w:rPr>
@@ -663,7 +737,7 @@
           <w:ilvl w:val="0"/>
           <w:numId w:val="2"/>
         </w:numPr>
-        <w:spacing w:after="30"/>
+        <w:spacing w:after="20"/>
       </w:pPr>
       <w:r>
         <w:rPr>
@@ -693,7 +767,7 @@
           <w:ilvl w:val="0"/>
           <w:numId w:val="2"/>
         </w:numPr>
-        <w:spacing w:after="30"/>
+        <w:spacing w:after="20"/>
       </w:pPr>
       <w:r>
         <w:rPr>
@@ -723,7 +797,7 @@
           <w:ilvl w:val="0"/>
           <w:numId w:val="2"/>
         </w:numPr>
-        <w:spacing w:after="30"/>
+        <w:spacing w:after="20"/>
       </w:pPr>
       <w:r>
         <w:rPr>
@@ -751,7 +825,7 @@
         <w:pBdr>
           <w:bottom w:val="single" w:color="9CA3AF" w:sz="4"/>
         </w:pBdr>
-        <w:spacing w:after="40" w:before="120"/>
+        <w:spacing w:after="30" w:before="90"/>
       </w:pPr>
       <w:r>
         <w:rPr>
@@ -800,7 +874,7 @@
     </w:p>
     <w:sectPr>
       <w:pgSz w:w="12240" w:h="15840" w:orient="portrait"/>
-      <w:pgMar w:top="431" w:right="1008" w:bottom="431" w:left="1008" w:header="708" w:footer="708" w:gutter="0"/>
+      <w:pgMar w:top="259" w:right="1008" w:bottom="215" w:left="1008" w:header="708" w:footer="708" w:gutter="0"/>
       <w:pgNumType/>
       <w:docGrid w:linePitch="360"/>
     </w:sectPr>
@@ -888,6 +962,114 @@
 
 <file path=word/numbering.xml><?xml version="1.0" encoding="utf-8"?>
 <w:numbering xmlns:wpc="http://schemas.microsoft.com/office/word/2010/wordprocessingCanvas" xmlns:mc="http://schemas.openxmlformats.org/markup-compatibility/2006" xmlns:o="urn:schemas-microsoft-com:office:office" xmlns:r="http://schemas.openxmlformats.org/officeDocument/2006/relationships" xmlns:m="http://schemas.openxmlformats.org/officeDocument/2006/math" xmlns:v="urn:schemas-microsoft-com:vml" xmlns:wp14="http://schemas.microsoft.com/office/word/2010/wordprocessingDrawing" xmlns:wp="http://schemas.openxmlformats.org/drawingml/2006/wordprocessingDrawing" xmlns:w10="urn:schemas-microsoft-com:office:word" xmlns:w="http://schemas.openxmlformats.org/wordprocessingml/2006/main" xmlns:w14="http://schemas.microsoft.com/office/word/2010/wordml" xmlns:w15="http://schemas.microsoft.com/office/word/2012/wordml" xmlns:wpg="http://schemas.microsoft.com/office/word/2010/wordprocessingGroup" xmlns:wpi="http://schemas.microsoft.com/office/word/2010/wordprocessingInk" xmlns:wne="http://schemas.microsoft.com/office/word/2006/wordml" xmlns:wps="http://schemas.microsoft.com/office/word/2010/wordprocessingShape" mc:Ignorable="w14 w15 wp14">
+  <w:abstractNum w:abstractNumId="1" w15:restartNumberingAfterBreak="0">
+    <w:multiLevelType w:val="hybridMultilevel"/>
+    <w:lvl w:ilvl="0" w15:tentative="1">
+      <w:start w:val="1"/>
+      <w:numFmt w:val="bullet"/>
+      <w:lvlText w:val="●"/>
+      <w:lvlJc w:val="left"/>
+      <w:pPr>
+        <w:ind w:left="720" w:hanging="360"/>
+      </w:pPr>
+    </w:lvl>
+    <w:lvl w:ilvl="1" w15:tentative="1">
+      <w:start w:val="1"/>
+      <w:numFmt w:val="bullet"/>
+      <w:lvlText w:val="○"/>
+      <w:lvlJc w:val="left"/>
+      <w:pPr>
+        <w:ind w:left="1440" w:hanging="360"/>
+      </w:pPr>
+    </w:lvl>
+    <w:lvl w:ilvl="2" w15:tentative="1">
+      <w:start w:val="1"/>
+      <w:numFmt w:val="bullet"/>
+      <w:lvlText w:val="■"/>
+      <w:lvlJc w:val="left"/>
+      <w:pPr>
+        <w:ind w:left="2160" w:hanging="360"/>
+      </w:pPr>
+    </w:lvl>
+    <w:lvl w:ilvl="3" w15:tentative="1">
+      <w:start w:val="1"/>
+      <w:numFmt w:val="bullet"/>
+      <w:lvlText w:val="●"/>
+      <w:lvlJc w:val="left"/>
+      <w:pPr>
+        <w:ind w:left="2880" w:hanging="360"/>
+      </w:pPr>
+    </w:lvl>
+    <w:lvl w:ilvl="4" w15:tentative="1">
+      <w:start w:val="1"/>
+      <w:numFmt w:val="bullet"/>
+      <w:lvlText w:val="○"/>
+      <w:lvlJc w:val="left"/>
+      <w:pPr>
+        <w:ind w:left="3600" w:hanging="360"/>
+      </w:pPr>
+    </w:lvl>
+    <w:lvl w:ilvl="5" w15:tentative="1">
+      <w:start w:val="1"/>
+      <w:numFmt w:val="bullet"/>
+      <w:lvlText w:val="■"/>
+      <w:lvlJc w:val="left"/>
+      <w:pPr>
+        <w:ind w:left="4320" w:hanging="360"/>
+      </w:pPr>
+    </w:lvl>
+    <w:lvl w:ilvl="6" w15:tentative="1">
+      <w:start w:val="1"/>
+      <w:numFmt w:val="bullet"/>
+      <w:lvlText w:val="●"/>
+      <w:lvlJc w:val="left"/>
+      <w:pPr>
+        <w:ind w:left="5040" w:hanging="360"/>
+      </w:pPr>
+    </w:lvl>
+    <w:lvl w:ilvl="7" w15:tentative="1">
+      <w:start w:val="1"/>
+      <w:numFmt w:val="bullet"/>
+      <w:lvlText w:val="●"/>
+      <w:lvlJc w:val="left"/>
+      <w:pPr>
+        <w:ind w:left="5760" w:hanging="360"/>
+      </w:pPr>
+    </w:lvl>
+    <w:lvl w:ilvl="8" w15:tentative="1">
+      <w:start w:val="1"/>
+      <w:numFmt w:val="bullet"/>
+      <w:lvlText w:val="●"/>
+      <w:lvlJc w:val="left"/>
+      <w:pPr>
+        <w:ind w:left="6480" w:hanging="360"/>
+      </w:pPr>
+    </w:lvl>
+  </w:abstractNum>
+  <w:abstractNum w:abstractNumId="2" w15:restartNumberingAfterBreak="0">
+    <w:multiLevelType w:val="hybridMultilevel"/>
+    <w:lvl w:ilvl="0" w15:tentative="1">
+      <w:start w:val="1"/>
+      <w:numFmt w:val="bullet"/>
+      <w:lvlText w:val="•"/>
+      <w:lvlJc w:val="left"/>
+      <w:pPr>
+        <w:ind w:left="316" w:hanging="230"/>
+      </w:pPr>
+    </w:lvl>
+  </w:abstractNum>
+  <w:num w:numId="1">
+    <w:abstractNumId w:val="1"/>
+    <w:lvlOverride w:ilvl="0">
+      <w:startOverride w:val="1"/>
+    </w:lvlOverride>
+  </w:num>
+  <w:num w:numId="2">
+    <w:abstractNumId w:val="2"/>
+    <w:lvlOverride w:ilvl="0">
+      <w:startOverride w:val="1"/>
+    </w:lvlOverride>
+  </w:num>
   <w:abstractNum w:abstractNumId="1" w15:restartNumberingAfterBreak="0">
     <w:multiLevelType w:val="hybridMultilevel"/>
     <w:lvl w:ilvl="0" w15:tentative="1">

</xml_diff>

<commit_message>
only one file image
</commit_message>
<xml_diff>
--- a/Hamza-Syrage-Frontend-Engineer-Resume.docx
+++ b/Hamza-Syrage-Frontend-Engineer-Resume.docx
@@ -53,7 +53,7 @@
         <w:br/>
         <w:t xml:space="preserve"/>
       </w:r>
-      <w:hyperlink w:history="1" r:id="rIdj79fjizi2n39utsxfxwrm">
+      <w:hyperlink w:history="1" r:id="rIdisjld-0g6fgv9o7cnlp6z">
         <w:r>
           <w:rPr>
             <w:rStyle w:val="Hyperlink"/>
@@ -74,7 +74,7 @@
         </w:rPr>
         <w:t xml:space="preserve">  |  </w:t>
       </w:r>
-      <w:hyperlink w:history="1" r:id="rIdyd_jdugpahdc97tpm8mnz">
+      <w:hyperlink w:history="1" r:id="rIdkgao8g8ilkzdrxfmjebrx">
         <w:r>
           <w:rPr>
             <w:rStyle w:val="Hyperlink"/>
@@ -95,7 +95,7 @@
         </w:rPr>
         <w:t xml:space="preserve">  |  </w:t>
       </w:r>
-      <w:hyperlink w:history="1" r:id="rIds1c7ssyv4fadixpyvlfe-">
+      <w:hyperlink w:history="1" r:id="rIdf197grqtvc-15iddphuve">
         <w:r>
           <w:rPr>
             <w:rStyle w:val="Hyperlink"/>
@@ -188,7 +188,7 @@
         </w:rPr>
         <w:t xml:space="preserve">Frontend Developer - </w:t>
       </w:r>
-      <w:hyperlink w:history="1" r:id="rIdsl-8xxpjkkgdbyrybkzrt">
+      <w:hyperlink w:history="1" r:id="rIdg3rjoamul22q0lneocbty">
         <w:r>
           <w:rPr>
             <w:rStyle w:val="Hyperlink"/>
@@ -227,7 +227,7 @@
         </w:rPr>
         <w:t xml:space="preserve">Remote (UAE) - client work delivered for </w:t>
       </w:r>
-      <w:hyperlink w:history="1" r:id="rIddoieuxa9jjewkk6iy3jun">
+      <w:hyperlink w:history="1" r:id="rIde32b1zcnssyuiqbzgenyt">
         <w:r>
           <w:rPr>
             <w:rStyle w:val="Hyperlink"/>
@@ -398,7 +398,7 @@
         </w:rPr>
         <w:t xml:space="preserve">Portfolio Site - </w:t>
       </w:r>
-      <w:hyperlink w:history="1" r:id="rIdy4womxqklgpfg5qxpqdi_">
+      <w:hyperlink w:history="1" r:id="rId4cyb59zlf3yxjwuzhqkgh">
         <w:r>
           <w:rPr>
             <w:rStyle w:val="Hyperlink"/>
@@ -448,7 +448,7 @@
         </w:rPr>
         <w:t xml:space="preserve">3D Physics-Based Ping Pong Simulation - </w:t>
       </w:r>
-      <w:hyperlink w:history="1" r:id="rIdieygxzjqj1hcozkwl_bfr">
+      <w:hyperlink w:history="1" r:id="rIdnwxzvhmn7rxqz8kteqoig">
         <w:r>
           <w:rPr>
             <w:rStyle w:val="Hyperlink"/>
@@ -498,7 +498,7 @@
         </w:rPr>
         <w:t xml:space="preserve">StayBay - </w:t>
       </w:r>
-      <w:hyperlink w:history="1" r:id="rIdovkpacrt508dpmyyc9m_z">
+      <w:hyperlink w:history="1" r:id="rIdnvbetwpgl-ac4ivj1qyx5">
         <w:r>
           <w:rPr>
             <w:rStyle w:val="Hyperlink"/>

</xml_diff>